<commit_message>
Add interactive BSA and AML investigation portfolio
</commit_message>
<xml_diff>
--- a/assets/Erik_Yeghinyan_BSA_Specialist_Resume.docx
+++ b/assets/Erik_Yeghinyan_BSA_Specialist_Resume.docx
@@ -4,27 +4,25 @@
   <w:body>
     <w:p>
       <w:pPr>
-        <w:pStyle w:val="ResumeName"/>
-        <w:jc w:val="center"/>
+        <w:pStyle w:val="Title"/>
       </w:pPr>
       <w:r>
         <w:t>ERIK YEGHINYAN</w:t>
       </w:r>
     </w:p>
     <w:p>
-      <w:pPr>
-        <w:jc w:val="center"/>
-      </w:pPr>
       <w:r>
-        <w:t>BSA SPECIALIST  |  AML INVESTIGATIONS  |  TRANSACTION MONITORING</w:t>
+        <w:t>BSA Specialist | AML Investigations | Transaction Monitoring</w:t>
       </w:r>
     </w:p>
     <w:p>
-      <w:pPr>
-        <w:jc w:val="center"/>
-      </w:pPr>
       <w:r>
-        <w:t>508-815-9050  •  eyeghinyane@gmail.com  •  linkedin.com/in/erik-yeghinyan</w:t>
+        <w:t>Hyannis, MA | Relocating to Southern California | 508-815-9050 | eyeghinyane@gmail.com</w:t>
+      </w:r>
+    </w:p>
+    <w:p>
+      <w:r>
+        <w:t>linkedin.com/in/erik-yeghinyan</w:t>
       </w:r>
     </w:p>
     <w:p>
@@ -37,7 +35,7 @@
     </w:p>
     <w:p>
       <w:r>
-        <w:t>BSA/AML analyst who helps investigators spend time on the alerts that warrant it. On Guidehouse’s Green Dot Bank engagement, reviewed 30+ accounts daily and identified patterns associated with 25% faster reviews and 30% fewer false-positive escalations. Combines transaction history, customer due diligence and screening research into documented decisions; also brings branch cash-control experience.</w:t>
+        <w:t>BSA/AML investigator with transaction monitoring, CTR and SAR filing, OFAC alert decisions and enhanced due diligence experience. Reviewed 30+ accounts daily at Guidehouse and identified trends associated with 25% faster reviews and 30% fewer false-positive escalations.</w:t>
       </w:r>
     </w:p>
     <w:p>
@@ -45,12 +43,12 @@
         <w:pStyle w:val="Section"/>
       </w:pPr>
       <w:r>
-        <w:t>BSA AND INVESTIGATIONS SKILLS</w:t>
+        <w:t>RELEVANT SKILLS</w:t>
       </w:r>
     </w:p>
     <w:p>
       <w:r>
-        <w:t>Bank Secrecy Act (BSA) and anti-money laundering (AML) • Transaction monitoring and alert investigation • Suspicious activity identification and SAR referral support • ACH and P2P activity review • Customer identity verification, KYC and customer due diligence (CDD) • Customer risk profiles • Fraud and account takeover review • Investigative case notes and audit-ready evidence • Branch cash transaction controls • World-Check • Unit21 • OSINT • Excel and Google Sheets</w:t>
+        <w:t>BSA, USA PATRIOT Act and OFAC • AML, CIP, KYC, CDD and EDD • Reports, logs and transaction data • CTRs and aggregated cash • SAR investigation reports • OFAC true or false matches • Structuring, fraud and illegal MSB activity • High-risk accounts and entities • Unit21, World-Check, Symitar and SanAlert • Exempt-customer list • Audits and examinations • Metrics and ratios</w:t>
       </w:r>
     </w:p>
     <w:p>
@@ -63,72 +61,154 @@
     </w:p>
     <w:p>
       <w:pPr>
-        <w:pStyle w:val="Role"/>
+        <w:pStyle w:val="Job"/>
       </w:pPr>
       <w:r>
-        <w:t>Guidehouse  |  AML Compliance Analyst, Green Dot Bank engagement  |  Vilnius, Lithuania  |  Sep 2024 – Sep 2025</w:t>
+        <w:t>Guidehouse | AML Compliance Analyst, Green Dot Bank engagement | Vilnius, Lithuania | Sep 2024 – Sep 2025</w:t>
       </w:r>
     </w:p>
     <w:p>
       <w:pPr>
-        <w:spacing w:after="20"/>
-        <w:ind w:left="259" w:hanging="187"/>
+        <w:ind w:left="245" w:hanging="202"/>
       </w:pPr>
       <w:r>
-        <w:t>•  Improved review efficiency by 25% and reduced false-positive escalations by 30% by recognizing recurring alert patterns and refining triage, leaving fewer low-value cases for follow-up.</w:t>
+        <w:t>•  Improved review efficiency by 25% and reduced false-positive escalations by 30% by analyzing daily reports, alert logs and transaction trends with internal reporting metrics.</w:t>
       </w:r>
     </w:p>
     <w:p>
       <w:pPr>
-        <w:spacing w:after="20"/>
-        <w:ind w:left="259" w:hanging="187"/>
+        <w:ind w:left="245" w:hanging="202"/>
       </w:pPr>
       <w:r>
-        <w:t>•  Kept 30+ daily account reviews moving toward defensible closure or escalation by checking ACH and P2P activity and account takeover indicators against customer profiles, history and counterparties.</w:t>
+        <w:t>•  Reached documented closure or escalation decisions on 30+ accounts daily by researching ACH, P2P and large day-to-day account activity for suspicious transactions, structuring and fraud indicators.</w:t>
       </w:r>
     </w:p>
     <w:p>
       <w:pPr>
-        <w:spacing w:after="20"/>
-        <w:ind w:left="259" w:hanging="187"/>
+        <w:ind w:left="245" w:hanging="202"/>
       </w:pPr>
       <w:r>
-        <w:t>•  Preserved the evidence behind risk decisions in Unit21 by connecting KYC/CDD records, World-Check screening and open-source research to case narratives and suspicious activity referrals.</w:t>
+        <w:t>•  Filed timely CTRs after aggregating ATM and multiple-branch cash deposits and withdrawals; prepared and filed SARs using interviews, transaction timelines, investigative notes and supporting evidence.</w:t>
       </w:r>
     </w:p>
     <w:p>
       <w:pPr>
-        <w:pStyle w:val="Role"/>
+        <w:ind w:left="245" w:hanging="202"/>
       </w:pPr>
       <w:r>
-        <w:t>ID Bank  |  Compliance Operations Specialist  |  Yerevan, Armenia (remote)  |  Sep 2023 – Sep 2024</w:t>
+        <w:t>•  Determined actual versus false OFAC matches using identifying details and World-Check research; maintained currency-reporting exemption records and assembled BSA documentation for audits and regulatory examinations.</w:t>
       </w:r>
     </w:p>
     <w:p>
       <w:pPr>
-        <w:spacing w:after="20"/>
-        <w:ind w:left="259" w:hanging="187"/>
+        <w:ind w:left="245" w:hanging="202"/>
       </w:pPr>
       <w:r>
-        <w:t>•  Prevented unresolved identity discrepancies from reaching onboarding decisions by checking customer documents against account information and updating risk profiles.</w:t>
+        <w:t>•  Resolved BSA and OFAC questions from branch and operations teams by researching current requirements in regulatory publications, reviewing case facts and explaining reporting or escalation steps.</w:t>
       </w:r>
     </w:p>
     <w:p>
       <w:pPr>
-        <w:spacing w:after="20"/>
-        <w:ind w:left="259" w:hanging="187"/>
+        <w:pStyle w:val="Job"/>
       </w:pPr>
       <w:r>
-        <w:t>•  Put unusual payments and account behavior in front of fraud reviewers by recording the indicators and evidence behind each escalation.</w:t>
+        <w:t>Swedbank Lithuania | AML Compliance Analyst, Transaction Monitoring | Lithuania | 2024 – 2025</w:t>
       </w:r>
     </w:p>
     <w:p>
       <w:pPr>
-        <w:spacing w:after="20"/>
-        <w:ind w:left="259" w:hanging="187"/>
+        <w:ind w:left="245" w:hanging="202"/>
       </w:pPr>
       <w:r>
-        <w:t>•  Kept exception handoffs usable for the next reviewer by documenting open questions and follow-up in customer records.</w:t>
+        <w:t>•  Identified unusual digital payment and account activity by analyzing transaction amounts, frequency, counterparties, reports and established customer behavior.</w:t>
+      </w:r>
+    </w:p>
+    <w:p>
+      <w:pPr>
+        <w:ind w:left="245" w:hanging="202"/>
+      </w:pPr>
+      <w:r>
+        <w:t>•  Documented investigations of possible money laundering, terrorist financing, internal or external fraud, structuring and illegal money service business activity with transaction timelines and reasons for escalation.</w:t>
+      </w:r>
+    </w:p>
+    <w:p>
+      <w:pPr>
+        <w:ind w:left="245" w:hanging="202"/>
+      </w:pPr>
+      <w:r>
+        <w:t>•  Clarified higher-risk account decisions by researching KYC/CDD records, entity information and mitigating evidence before documenting alert dispositions.</w:t>
+      </w:r>
+    </w:p>
+    <w:p>
+      <w:pPr>
+        <w:pStyle w:val="Job"/>
+      </w:pPr>
+      <w:r>
+        <w:t>ID Bank | Compliance Operations Specialist | Yerevan, Armenia, remote | Sep 2023 – Sep 2024</w:t>
+      </w:r>
+    </w:p>
+    <w:p>
+      <w:pPr>
+        <w:ind w:left="245" w:hanging="202"/>
+      </w:pPr>
+      <w:r>
+        <w:t>•  Kept unresolved identity discrepancies out of onboarding decisions by checking customer documents against account information and updating risk profiles.</w:t>
+      </w:r>
+    </w:p>
+    <w:p>
+      <w:pPr>
+        <w:ind w:left="245" w:hanging="202"/>
+      </w:pPr>
+      <w:r>
+        <w:t>•  Gave fraud and compliance reviewers usable evidence on unusual payments by recording indicators, supporting details and reasons for escalation.</w:t>
+      </w:r>
+    </w:p>
+    <w:p>
+      <w:pPr>
+        <w:ind w:left="245" w:hanging="202"/>
+      </w:pPr>
+      <w:r>
+        <w:t>•  Completed higher-risk customer reviews by comparing identity records, payment activity and expected account use, then updating risk profiles and routing exceptions.</w:t>
+      </w:r>
+    </w:p>
+    <w:p>
+      <w:pPr>
+        <w:pStyle w:val="Job"/>
+      </w:pPr>
+      <w:r>
+        <w:t>Santander Bank USA | Teller and Relationship Banker | Hyannis, MA | May 2026 – Sep 2026</w:t>
+      </w:r>
+    </w:p>
+    <w:p>
+      <w:pPr>
+        <w:ind w:left="245" w:hanging="202"/>
+      </w:pPr>
+      <w:r>
+        <w:t>•  Processed 40+ daily deposits, withdrawals, transfers and payments while checking customer identity, account authority and transaction details; escalated exceptions that required further review.</w:t>
+      </w:r>
+    </w:p>
+    <w:p>
+      <w:pPr>
+        <w:ind w:left="245" w:hanging="202"/>
+      </w:pPr>
+      <w:r>
+        <w:t>•  Reviewed business checks against account information and transaction history, questioned unusual check or account activity and escalated exceptions with the specific issue recorded for follow-up.</w:t>
+      </w:r>
+    </w:p>
+    <w:p>
+      <w:pPr>
+        <w:ind w:left="245" w:hanging="202"/>
+      </w:pPr>
+      <w:r>
+        <w:t>•  Opened cases for unusual account activity by examining recent transactions and customer behavior, recording the alert trigger, transaction details and reason the activity warranted BSA review.</w:t>
+      </w:r>
+    </w:p>
+    <w:p>
+      <w:pPr>
+        <w:ind w:left="245" w:hanging="202"/>
+      </w:pPr>
+      <w:r>
+        <w:t>•  Flagged cash transactions for CTR review through SanAlert and sent unusual-activity cases with supporting transaction details to the BSA team.</w:t>
       </w:r>
     </w:p>
     <w:p>
@@ -136,86 +216,32 @@
         <w:pStyle w:val="Section"/>
       </w:pPr>
       <w:r>
-        <w:t>ADDITIONAL BANKING EXPERIENCE</w:t>
-      </w:r>
-    </w:p>
-    <w:p>
-      <w:pPr>
-        <w:pStyle w:val="Role"/>
-      </w:pPr>
-      <w:r>
-        <w:t>Santander Bank  |  Teller and Relationship Banker  |  Hyannis, MA  |  May 2026 – Sep 2026</w:t>
-      </w:r>
-    </w:p>
-    <w:p>
-      <w:pPr>
-        <w:spacing w:after="20"/>
-        <w:ind w:left="259" w:hanging="187"/>
-      </w:pPr>
-      <w:r>
-        <w:t>•  Protected the accuracy of 40+ daily deposits, withdrawals, transfers and payments through customer identity, authorization and cash-control checks.</w:t>
-      </w:r>
-    </w:p>
-    <w:p>
-      <w:pPr>
-        <w:spacing w:after="20"/>
-        <w:ind w:left="259" w:hanging="187"/>
-      </w:pPr>
-      <w:r>
-        <w:t>•  Brought unusual account behavior and cash-related exceptions to branch review by preserving transaction details and escalating concerns under fraud and BSA procedures.</w:t>
-      </w:r>
-    </w:p>
-    <w:p>
-      <w:pPr>
-        <w:spacing w:after="20"/>
-        <w:ind w:left="259" w:hanging="187"/>
-      </w:pPr>
-      <w:r>
-        <w:t>•  Earned 10/10 customer survey ratings while resolving account and digital banking issues within verification and privacy requirements.</w:t>
-      </w:r>
-    </w:p>
-    <w:p>
-      <w:pPr>
-        <w:pStyle w:val="Section"/>
-      </w:pPr>
-      <w:r>
-        <w:t>EDUCATION</w:t>
+        <w:t>EDUCATION AND TRAINING</w:t>
       </w:r>
     </w:p>
     <w:p>
       <w:r>
-        <w:t>Bachelor of Arts in Contemporary Communication  |  LCC International University, Lithuania  |  2024</w:t>
-      </w:r>
-    </w:p>
-    <w:p>
-      <w:pPr>
-        <w:pStyle w:val="Section"/>
-      </w:pPr>
-      <w:r>
-        <w:t>CERTIFICATIONS AND TRAINING</w:t>
+        <w:t>BA, Contemporary Communication | LCC International University, Lithuania | 2024</w:t>
       </w:r>
     </w:p>
     <w:p>
       <w:r>
-        <w:t>Operational Analysis of Suspicious Transaction Reports — Basel Institute on Governance, 2026 • Enhancing Financial Inclusion with a Risk-Based Approach — ACAMS • Foundations in AML and KYC</w:t>
-      </w:r>
-    </w:p>
-    <w:p>
-      <w:pPr>
-        <w:pStyle w:val="Section"/>
-      </w:pPr>
-      <w:r>
-        <w:t>LANGUAGES AND WORK AUTHORIZATION</w:t>
+        <w:t>Operational Analysis of Suspicious Transaction Reports | Basel Institute on Governance | 2026</w:t>
       </w:r>
     </w:p>
     <w:p>
       <w:r>
-        <w:t>Armenian (native) • English (fluent) • Russian (advanced) • Authorized to work in the United States without sponsorship</w:t>
+        <w:t>Enhancing Financial Inclusion with a Risk-Based Approach | ACAMS</w:t>
+      </w:r>
+    </w:p>
+    <w:p>
+      <w:r>
+        <w:t>Languages: Armenian (native), English (fluent), Russian (advanced) | U.S. work authorized without sponsorship</w:t>
       </w:r>
     </w:p>
     <w:sectPr>
       <w:pgSz w:w="12240" w:h="15840"/>
-      <w:pgMar w:top="691" w:right="1037" w:bottom="619" w:left="1037" w:header="720" w:footer="720" w:gutter="0"/>
+      <w:pgMar w:top="634" w:right="922" w:bottom="619" w:left="922" w:header="720" w:footer="720" w:gutter="0"/>
       <w:cols w:space="720"/>
       <w:docGrid w:linePitch="360"/>
     </w:sectPr>
@@ -587,11 +613,12 @@
     <w:qFormat/>
     <w:rsid w:val="00FC693F"/>
     <w:pPr>
-      <w:spacing w:after="20" w:line="240" w:lineRule="auto"/>
+      <w:spacing w:after="14"/>
     </w:pPr>
     <w:rPr>
       <w:rFonts w:ascii="Aptos" w:hAnsi="Aptos"/>
-      <w:sz w:val="17"/>
+      <w:color w:val="000000"/>
+      <w:sz w:val="16"/>
     </w:rPr>
   </w:style>
   <w:style w:type="paragraph" w:styleId="Header">
@@ -938,15 +965,16 @@
       <w:pBdr>
         <w:bottom w:val="single" w:sz="8" w:space="4" w:color="4F81BD" w:themeColor="accent1"/>
       </w:pBdr>
-      <w:spacing w:after="300" w:line="240" w:lineRule="auto"/>
+      <w:spacing w:after="20" w:line="240" w:lineRule="auto" w:before="0"/>
       <w:contextualSpacing/>
     </w:pPr>
     <w:rPr>
-      <w:rFonts w:asciiTheme="majorHAnsi" w:eastAsiaTheme="majorEastAsia" w:hAnsiTheme="majorHAnsi" w:cstheme="majorBidi"/>
-      <w:color w:val="17365D" w:themeColor="text2" w:themeShade="BF"/>
+      <w:rFonts w:asciiTheme="majorHAnsi" w:eastAsiaTheme="majorEastAsia" w:hAnsiTheme="majorHAnsi" w:cstheme="majorBidi" w:ascii="Aptos" w:hAnsi="Aptos"/>
+      <w:b/>
+      <w:color w:val="000000"/>
       <w:spacing w:val="5"/>
       <w:kern w:val="28"/>
-      <w:sz w:val="52"/>
+      <w:sz w:val="30"/>
       <w:szCs w:val="52"/>
     </w:rPr>
   </w:style>
@@ -12276,37 +12304,22 @@
       </w:tcPr>
     </w:tblStylePr>
   </w:style>
-  <w:style w:type="paragraph" w:customStyle="1" w:styleId="ResumeName">
-    <w:name w:val="ResumeName"/>
-    <w:pPr>
-      <w:keepNext/>
-      <w:spacing w:before="0" w:after="60"/>
+  <w:style w:type="paragraph" w:customStyle="1" w:styleId="Section">
+    <w:name w:val="Section"/>
+    <w:pPr>
+      <w:spacing w:before="80" w:after="40"/>
     </w:pPr>
     <w:rPr>
       <w:rFonts w:ascii="Aptos" w:hAnsi="Aptos"/>
       <w:b/>
       <w:color w:val="000000"/>
-      <w:sz w:val="34"/>
+      <w:sz w:val="19"/>
     </w:rPr>
   </w:style>
-  <w:style w:type="paragraph" w:customStyle="1" w:styleId="Section">
-    <w:name w:val="Section"/>
-    <w:pPr>
-      <w:keepNext/>
-      <w:spacing w:before="100" w:after="60"/>
-    </w:pPr>
-    <w:rPr>
-      <w:rFonts w:ascii="Aptos" w:hAnsi="Aptos"/>
-      <w:b/>
-      <w:color w:val="000000"/>
-      <w:sz w:val="18"/>
-    </w:rPr>
-  </w:style>
-  <w:style w:type="paragraph" w:customStyle="1" w:styleId="Role">
-    <w:name w:val="Role"/>
-    <w:pPr>
-      <w:keepNext/>
-      <w:spacing w:before="40" w:after="20"/>
+  <w:style w:type="paragraph" w:customStyle="1" w:styleId="Job">
+    <w:name w:val="Job"/>
+    <w:pPr>
+      <w:spacing w:before="40" w:after="0"/>
     </w:pPr>
     <w:rPr>
       <w:rFonts w:ascii="Aptos" w:hAnsi="Aptos"/>

</xml_diff>